<commit_message>
fix 1894-95 missing data
</commit_message>
<xml_diff>
--- a/assets/input/1894-95/1894-95.docx
+++ b/assets/input/1894-95/1894-95.docx
@@ -11642,9 +11642,10 @@
           <w:rFonts w:ascii="Garamond" w:cs="Garamond" w:eastAsia="Garamond" w:hAnsi="Garamond"/>
           <w:sz w:val="23"/>
           <w:szCs w:val="23"/>
-          <w:rtl w:val="0"/>
-        </w:rPr>
-        <w:t xml:space="preserve">Saturday, June 2, 1894, Florence</w:t>
+          <w:u w:val="single"/>
+          <w:rtl w:val="0"/>
+        </w:rPr>
+        <w:t>Saturday, June 2, 1894, Florence</w:t>
       </w:r>
     </w:p>
     <w:p>
@@ -13085,41 +13086,6 @@
           <w:tab w:val="left" w:leader="none" w:pos="6160"/>
           <w:tab w:val="left" w:leader="none" w:pos="6720"/>
         </w:tabs>
-        <w:spacing w:line="250" w:lineRule="auto"/>
-        <w:jc w:val="center"/>
-        <w:rPr>
-          <w:rFonts w:ascii="Garamond" w:cs="Garamond" w:eastAsia="Garamond" w:hAnsi="Garamond"/>
-          <w:sz w:val="23"/>
-          <w:szCs w:val="23"/>
-        </w:rPr>
-      </w:pPr>
-      <w:r>
-        <w:rPr>
-          <w:rFonts w:ascii="Garamond" w:cs="Garamond" w:eastAsia="Garamond" w:hAnsi="Garamond"/>
-          <w:sz w:val="23"/>
-          <w:szCs w:val="23"/>
-          <w:rtl w:val="0"/>
-        </w:rPr>
-        <w:t xml:space="preserve">[London. Thursday. August 23. 1894]</w:t>
-      </w:r>
-    </w:p>
-    <w:p>
-      <w:pPr>
-        <w:widowControl w:val="0"/>
-        <w:tabs>
-          <w:tab w:val="left" w:leader="none" w:pos="560"/>
-          <w:tab w:val="left" w:leader="none" w:pos="1120"/>
-          <w:tab w:val="left" w:leader="none" w:pos="1680"/>
-          <w:tab w:val="left" w:leader="none" w:pos="2240"/>
-          <w:tab w:val="left" w:leader="none" w:pos="2800"/>
-          <w:tab w:val="left" w:leader="none" w:pos="3360"/>
-          <w:tab w:val="left" w:leader="none" w:pos="3920"/>
-          <w:tab w:val="left" w:leader="none" w:pos="4480"/>
-          <w:tab w:val="left" w:leader="none" w:pos="5040"/>
-          <w:tab w:val="left" w:leader="none" w:pos="5600"/>
-          <w:tab w:val="left" w:leader="none" w:pos="6160"/>
-          <w:tab w:val="left" w:leader="none" w:pos="6720"/>
-        </w:tabs>
         <w:spacing w:line="260" w:lineRule="auto"/>
         <w:ind w:firstLine="170"/>
         <w:rPr>
@@ -19465,9 +19431,19 @@
           <w:rFonts w:ascii="Garamond" w:cs="Garamond" w:eastAsia="Garamond" w:hAnsi="Garamond"/>
           <w:sz w:val="23"/>
           <w:szCs w:val="23"/>
-          <w:rtl w:val="0"/>
-        </w:rPr>
-        <w:t xml:space="preserve">Thursday, Jan. 31, 1895 </w:t>
+          <w:u w:val="single"/>
+          <w:rtl w:val="0"/>
+        </w:rPr>
+        <w:t>Thursday, Jan. 31, 1895</w:t>
+      </w:r>
+      <w:r>
+        <w:rPr>
+          <w:rFonts w:ascii="Garamond" w:cs="Garamond" w:eastAsia="Garamond" w:hAnsi="Garamond"/>
+          <w:sz w:val="23"/>
+          <w:szCs w:val="23"/>
+          <w:rtl w:val="0"/>
+        </w:rPr>
+        <w:t xml:space="preserve"> </w:t>
       </w:r>
     </w:p>
     <w:p>
@@ -23237,31 +23213,9 @@
           <w:rtl w:val="0"/>
         </w:rPr>
       </w:r>
-    </w:p>
-    <w:p>
-      <w:pPr>
-        <w:widowControl w:val="0"/>
-        <w:tabs>
-          <w:tab w:val="left" w:leader="none" w:pos="560"/>
-          <w:tab w:val="left" w:leader="none" w:pos="1120"/>
-          <w:tab w:val="left" w:leader="none" w:pos="1680"/>
-          <w:tab w:val="left" w:leader="none" w:pos="2240"/>
-          <w:tab w:val="left" w:leader="none" w:pos="2800"/>
-          <w:tab w:val="left" w:leader="none" w:pos="3360"/>
-          <w:tab w:val="left" w:leader="none" w:pos="3920"/>
-          <w:tab w:val="left" w:leader="none" w:pos="4480"/>
-          <w:tab w:val="left" w:leader="none" w:pos="5040"/>
-          <w:tab w:val="left" w:leader="none" w:pos="5600"/>
-          <w:tab w:val="left" w:leader="none" w:pos="6160"/>
-          <w:tab w:val="left" w:leader="none" w:pos="6720"/>
-        </w:tabs>
-        <w:spacing w:after="160" w:before="0" w:line="260" w:lineRule="auto"/>
-        <w:rPr>
-          <w:rFonts w:ascii="Garamond" w:cs="Garamond" w:eastAsia="Garamond" w:hAnsi="Garamond"/>
-          <w:sz w:val="16"/>
-          <w:szCs w:val="16"/>
-        </w:rPr>
-      </w:pPr>
+      <w:r>
+        <w:t xml:space="preserve"> </w:t>
+      </w:r>
       <w:r>
         <w:rPr>
           <w:rFonts w:ascii="Garamond" w:cs="Garamond" w:eastAsia="Garamond" w:hAnsi="Garamond"/>
@@ -30832,7 +30786,7 @@
           <w:szCs w:val="23"/>
           <w:rtl w:val="0"/>
         </w:rPr>
-        <w:t xml:space="preserve"> very hygienic. While Bernhard’s 0142] beating his brains to find the kernel of the </w:t>
+        <w:t xml:space="preserve"> very hygienic. While Bernhard’s [142] beating his brains to find the kernel of the </w:t>
       </w:r>
       <w:r>
         <w:rPr>
@@ -35388,32 +35342,9 @@
           <w:rtl w:val="0"/>
         </w:rPr>
       </w:r>
-    </w:p>
-    <w:p>
-      <w:pPr>
-        <w:widowControl w:val="0"/>
-        <w:tabs>
-          <w:tab w:val="left" w:leader="none" w:pos="560"/>
-          <w:tab w:val="left" w:leader="none" w:pos="1120"/>
-          <w:tab w:val="left" w:leader="none" w:pos="1680"/>
-          <w:tab w:val="left" w:leader="none" w:pos="2240"/>
-          <w:tab w:val="left" w:leader="none" w:pos="2800"/>
-          <w:tab w:val="left" w:leader="none" w:pos="3360"/>
-          <w:tab w:val="left" w:leader="none" w:pos="3920"/>
-          <w:tab w:val="left" w:leader="none" w:pos="4480"/>
-          <w:tab w:val="left" w:leader="none" w:pos="5040"/>
-          <w:tab w:val="left" w:leader="none" w:pos="5600"/>
-          <w:tab w:val="left" w:leader="none" w:pos="6160"/>
-          <w:tab w:val="left" w:leader="none" w:pos="6720"/>
-        </w:tabs>
-        <w:spacing w:line="260" w:lineRule="auto"/>
-        <w:rPr>
-          <w:rFonts w:ascii="Garamond" w:cs="Garamond" w:eastAsia="Garamond" w:hAnsi="Garamond"/>
-          <w:sz w:val="15"/>
-          <w:szCs w:val="15"/>
-          <w:vertAlign w:val="superscript"/>
-        </w:rPr>
-      </w:pPr>
+      <w:r>
+        <w:t xml:space="preserve"> </w:t>
+      </w:r>
       <w:r>
         <w:rPr>
           <w:rFonts w:ascii="Garamond" w:cs="Garamond" w:eastAsia="Garamond" w:hAnsi="Garamond"/>
@@ -37804,14 +37735,14 @@
       <w:r>
         <w:rPr>
           <w:rFonts w:ascii="Garamond" w:cs="Garamond" w:eastAsia="Garamond" w:hAnsi="Garamond"/>
-          <w:i w:val="1"/>
+          <w:i w:val="0"/>
           <w:iCs w:val="1"/>
           <w:sz w:val="23"/>
           <w:szCs w:val="23"/>
-          <w:u w:val="single"/>
-          <w:rtl w:val="0"/>
-        </w:rPr>
-        <w:t xml:space="preserve">Flaubert’</w:t>
+          <w:u w:val="none"/>
+          <w:rtl w:val="0"/>
+        </w:rPr>
+        <w:t>Flaubert’</w:t>
       </w:r>
       <w:r>
         <w:rPr>
@@ -40471,31 +40402,9 @@
           <w:rtl w:val="0"/>
         </w:rPr>
       </w:r>
-    </w:p>
-    <w:p>
-      <w:pPr>
-        <w:widowControl w:val="0"/>
-        <w:tabs>
-          <w:tab w:val="left" w:leader="none" w:pos="560"/>
-          <w:tab w:val="left" w:leader="none" w:pos="1120"/>
-          <w:tab w:val="left" w:leader="none" w:pos="1680"/>
-          <w:tab w:val="left" w:leader="none" w:pos="2240"/>
-          <w:tab w:val="left" w:leader="none" w:pos="2800"/>
-          <w:tab w:val="left" w:leader="none" w:pos="3360"/>
-          <w:tab w:val="left" w:leader="none" w:pos="3920"/>
-          <w:tab w:val="left" w:leader="none" w:pos="4480"/>
-          <w:tab w:val="left" w:leader="none" w:pos="5040"/>
-          <w:tab w:val="left" w:leader="none" w:pos="5600"/>
-          <w:tab w:val="left" w:leader="none" w:pos="6160"/>
-          <w:tab w:val="left" w:leader="none" w:pos="6720"/>
-        </w:tabs>
-        <w:spacing w:line="260" w:lineRule="auto"/>
-        <w:rPr>
-          <w:rFonts w:ascii="Garamond" w:cs="Garamond" w:eastAsia="Garamond" w:hAnsi="Garamond"/>
-          <w:sz w:val="23"/>
-          <w:szCs w:val="23"/>
-        </w:rPr>
-      </w:pPr>
+      <w:r>
+        <w:t xml:space="preserve"> </w:t>
+      </w:r>
       <w:r>
         <w:rPr>
           <w:rFonts w:ascii="Garamond" w:cs="Garamond" w:eastAsia="Garamond" w:hAnsi="Garamond"/>
@@ -45371,7 +45280,7 @@
           <w:szCs w:val="23"/>
           <w:rtl w:val="0"/>
         </w:rPr>
-        <w:t xml:space="preserve">[ 218] </w:t>
+        <w:t xml:space="preserve">[218] </w:t>
       </w:r>
       <w:r>
         <w:rPr>

</xml_diff>